<commit_message>
feat: 用 nature-skills 生成 H 版（nature 风）并全量核对 docx 与 PPT 口径
- 新增 code/make_ppt_nature.py：按 mqgg5630-cyber/nature-skills 的 nature-paper2ppt（Apache-2.0）出 H 版
  （resource 叙事弧 workflow-to-validation、结论式标题、图占主位、原生对照表、每页备注），
  并用 skill 自带 audit_pptx_quality.py 复核 -> findings 0
- 新增 code/fetch_nature_skills.py（按需下载 skill 到 build/，不入库）、code/check_consistency.py（口径核对）
- 新增 docs/术语表.md（terminology ledger）与 results/qa/（八版审计 + H 版 QA 报告）
- docx 正文 4 处措辞统一（AChE 首次给全称、阶段写明 NC/SCS/SCD/MCI/AD、Aβ 写法），格式校验仍全绿
- preview_ppt.py 支持原生表格渲染与幻灯片背景色
- 文档同步：README / deliverable / code / docs / skills 说明

Co-authored-by: arena-agent <297053741+arena-agent@users.noreply.github.com>
</commit_message>
<xml_diff>
--- a/deliverable/中期.docx
+++ b/deliverable/中期.docx
@@ -2405,7 +2405,7 @@
                   </w14:solidFill>
                 </w14:textFill>
               </w:rPr>
-              <w:t xml:space="preserve">4. 分阶段抗菌肽差异分析。依据认知功能评估与临床诊断信息，将队列划分为健康人群与各疾病阶段，在统一的丰度与组成口径下比较各阶段与健康人群之间候选抗菌肽的差异，识别随病程变化明显的候选抗菌肽，并从组成结构、丰度变化趋势与阶段间差异模式等角度进行描述，为特有肽筛选提供依据。</w:t>
+              <w:t xml:space="preserve">4. 分阶段抗菌肽差异分析。依据认知功能评估与临床诊断信息，将队列划分为健康对照（NC）、主观认知下降（SCS）、可疑认知障碍（SCD）、轻度认知障碍（MCI）与 AD 五个阶段，在统一的丰度与组成口径下比较各阶段与健康人群之间候选抗菌肽的差异，识别随病程变化明显的候选抗菌肽，并从组成结构、丰度变化趋势与阶段间差异模式等角度进行描述，为特有肽筛选提供依据。</w:t>
             </w:r>
           </w:p>
           <w:p>
@@ -2465,7 +2465,7 @@
                   </w14:solidFill>
                 </w14:textFill>
               </w:rPr>
-              <w:t xml:space="preserve">6. 特有抗菌肽与 AD 发病机制的关联分析。参照乙酰胆碱酯酶—β-淀粉样肽复合物分子模拟研究的思路，从三个方向考察特有抗菌肽与 AD 发病机制的关联：与 β-淀粉样肽的相互作用及其对聚集与纤维化过程的影响；与乙酰胆碱酯酶外周阴离子位点结合、从而干扰成核环节的可能性；经免疫调节与炎症通路参与神经炎症的可能性。分析结果以结合情况、复合物稳定性与通路层面的解释为主，研究定位为线索发现。</w:t>
+              <w:t xml:space="preserve">6. 特有抗菌肽与 AD 发病机制的关联分析。参照乙酰胆碱酯酶（acetylcholinesterase, AChE）—β-淀粉样肽复合物分子模拟研究的思路，从三个方向考察特有抗菌肽与 AD 发病机制的关联：与 β-淀粉样肽的相互作用及其对聚集与纤维化过程的影响；与 AChE 外周阴离子位点结合、从而干扰成核环节的可能性；经免疫调节与炎症通路参与神经炎症的可能性。分析结果以结合情况、复合物稳定性与通路层面的解释为主，研究定位为线索发现。</w:t>
             </w:r>
           </w:p>
           <w:p>
@@ -2857,7 +2857,7 @@
                   </w14:solidFill>
                 </w14:textFill>
               </w:rPr>
-              <w:t xml:space="preserve">6. 特有抗菌肽与 AD 发病机制的关联分析：进行中，分析方案已确定，正在开展与 β-淀粉样肽聚集、乙酰胆碱酯酶结合以及免疫炎症通路相关的关联分析。</w:t>
+              <w:t xml:space="preserve">6. 特有抗菌肽与 AD 发病机制的关联分析：进行中，分析方案已确定，正在开展与 Aβ 聚集、AChE 结合以及免疫炎症通路相关的关联分析。</w:t>
             </w:r>
           </w:p>
           <w:p>
@@ -3842,7 +3842,7 @@
                   </w14:solidFill>
                 </w14:textFill>
               </w:rPr>
-              <w:t xml:space="preserve">方案：参照乙酰胆碱酯酶—β-淀粉样肽复合物分子模拟研究的技术路线，采用分子对接与分子动力学模拟考察候选抗菌肽与 β-淀粉样肽、乙酰胆碱酯酶外周阴离子位点的结合模式与复合物稳定性，重点关注其对 β-淀粉样肽聚集过程与成核环节的可能影响；同时结合文献比对与功能注释，从免疫调节与炎症通路角度分析候选肽可能参与的作用环节。分析过程中保留参数设置与轨迹分析结果，以保证结论可复核。</w:t>
+              <w:t xml:space="preserve">方案：参照乙酰胆碱酯酶—β-淀粉样肽复合物分子模拟研究的技术路线，采用分子对接与分子动力学模拟考察候选抗菌肽与 Aβ、AChE 外周阴离子位点的结合模式与复合物稳定性，重点关注其对 Aβ 聚集过程与成核环节的可能影响；同时结合文献比对与功能注释，从免疫调节与炎症通路角度分析候选肽可能参与的作用环节。分析过程中保留参数设置与轨迹分析结果，以保证结论可复核。</w:t>
             </w:r>
           </w:p>
           <w:p>

</xml_diff>